<commit_message>
Added schema composition documents for schemas of CartItems, ShippingAddresses, Users, Products and ProductImages. Updated Relation_Between_API_and_Schema.docx
</commit_message>
<xml_diff>
--- a/Website/Design_Documents/Relation_between_API_and_Schema.docx
+++ b/Website/Design_Documents/Relation_between_API_and_Schema.docx
@@ -6,17 +6,18 @@
       <w:tblPr>
         <w:tblStyle w:val="TableGrid"/>
         <w:tblW w:w="0" w:type="auto"/>
+        <w:tblLayout w:type="fixed"/>
         <w:tblLook w:val="04A0" w:firstRow="1" w:lastRow="0" w:firstColumn="1" w:lastColumn="0" w:noHBand="0" w:noVBand="1"/>
       </w:tblPr>
       <w:tblGrid>
-        <w:gridCol w:w="2381"/>
-        <w:gridCol w:w="3433"/>
-        <w:gridCol w:w="3536"/>
+        <w:gridCol w:w="2572"/>
+        <w:gridCol w:w="3339"/>
+        <w:gridCol w:w="3439"/>
       </w:tblGrid>
       <w:tr>
         <w:tc>
           <w:tcPr>
-            <w:tcW w:w="2185" w:type="dxa"/>
+            <w:tcW w:w="2572" w:type="dxa"/>
           </w:tcPr>
           <w:p>
             <w:pPr>
@@ -40,7 +41,7 @@
         </w:tc>
         <w:tc>
           <w:tcPr>
-            <w:tcW w:w="3529" w:type="dxa"/>
+            <w:tcW w:w="3339" w:type="dxa"/>
           </w:tcPr>
           <w:p>
             <w:pPr>
@@ -64,7 +65,7 @@
         </w:tc>
         <w:tc>
           <w:tcPr>
-            <w:tcW w:w="3636" w:type="dxa"/>
+            <w:tcW w:w="3439" w:type="dxa"/>
           </w:tcPr>
           <w:p>
             <w:pPr>
@@ -90,612 +91,992 @@
       <w:tr>
         <w:tc>
           <w:tcPr>
-            <w:tcW w:w="2185" w:type="dxa"/>
-          </w:tcPr>
-          <w:p>
-            <w:pPr>
-              <w:rPr>
-                <w:sz w:val="22"/>
-                <w:szCs w:val="22"/>
-              </w:rPr>
-            </w:pPr>
-            <w:proofErr w:type="spellStart"/>
-            <w:r>
-              <w:rPr>
-                <w:sz w:val="22"/>
-                <w:szCs w:val="22"/>
+            <w:tcW w:w="2572" w:type="dxa"/>
+          </w:tcPr>
+          <w:p>
+            <w:pPr>
+              <w:rPr>
+                <w:sz w:val="18"/>
+                <w:szCs w:val="18"/>
+              </w:rPr>
+            </w:pPr>
+            <w:r>
+              <w:rPr>
+                <w:sz w:val="18"/>
+                <w:szCs w:val="18"/>
               </w:rPr>
               <w:t>registerUser</w:t>
             </w:r>
-            <w:proofErr w:type="spellEnd"/>
-          </w:p>
-        </w:tc>
-        <w:tc>
-          <w:tcPr>
-            <w:tcW w:w="3529" w:type="dxa"/>
-          </w:tcPr>
-          <w:p>
-            <w:pPr>
-              <w:rPr>
-                <w:sz w:val="22"/>
-                <w:szCs w:val="22"/>
-              </w:rPr>
-            </w:pPr>
-            <w:proofErr w:type="spellStart"/>
-            <w:r>
-              <w:rPr>
-                <w:sz w:val="22"/>
-                <w:szCs w:val="22"/>
+          </w:p>
+        </w:tc>
+        <w:tc>
+          <w:tcPr>
+            <w:tcW w:w="3339" w:type="dxa"/>
+          </w:tcPr>
+          <w:p>
+            <w:pPr>
+              <w:rPr>
+                <w:sz w:val="18"/>
+                <w:szCs w:val="18"/>
+              </w:rPr>
+            </w:pPr>
+            <w:r>
+              <w:rPr>
+                <w:sz w:val="18"/>
+                <w:szCs w:val="18"/>
               </w:rPr>
               <w:t>userRequestSchema</w:t>
             </w:r>
-            <w:proofErr w:type="spellEnd"/>
-          </w:p>
-        </w:tc>
-        <w:tc>
-          <w:tcPr>
-            <w:tcW w:w="3636" w:type="dxa"/>
-          </w:tcPr>
-          <w:p>
-            <w:pPr>
-              <w:rPr>
-                <w:sz w:val="22"/>
-                <w:szCs w:val="22"/>
-              </w:rPr>
-            </w:pPr>
-            <w:proofErr w:type="spellStart"/>
-            <w:r>
-              <w:rPr>
-                <w:sz w:val="22"/>
-                <w:szCs w:val="22"/>
+          </w:p>
+        </w:tc>
+        <w:tc>
+          <w:tcPr>
+            <w:tcW w:w="3439" w:type="dxa"/>
+          </w:tcPr>
+          <w:p>
+            <w:pPr>
+              <w:rPr>
+                <w:sz w:val="18"/>
+                <w:szCs w:val="18"/>
+              </w:rPr>
+            </w:pPr>
+            <w:r>
+              <w:rPr>
+                <w:sz w:val="18"/>
+                <w:szCs w:val="18"/>
               </w:rPr>
               <w:t>registerUserResponseSchema</w:t>
             </w:r>
-            <w:proofErr w:type="spellEnd"/>
           </w:p>
         </w:tc>
       </w:tr>
       <w:tr>
         <w:tc>
           <w:tcPr>
-            <w:tcW w:w="2185" w:type="dxa"/>
-          </w:tcPr>
-          <w:p>
-            <w:pPr>
-              <w:rPr>
-                <w:sz w:val="22"/>
-                <w:szCs w:val="22"/>
-              </w:rPr>
-            </w:pPr>
-            <w:proofErr w:type="spellStart"/>
-            <w:r>
-              <w:rPr>
-                <w:sz w:val="22"/>
-                <w:szCs w:val="22"/>
+            <w:tcW w:w="2572" w:type="dxa"/>
+          </w:tcPr>
+          <w:p>
+            <w:pPr>
+              <w:rPr>
+                <w:sz w:val="18"/>
+                <w:szCs w:val="18"/>
+              </w:rPr>
+            </w:pPr>
+            <w:r>
+              <w:rPr>
+                <w:sz w:val="18"/>
+                <w:szCs w:val="18"/>
               </w:rPr>
               <w:t>updateUser</w:t>
             </w:r>
-            <w:proofErr w:type="spellEnd"/>
-          </w:p>
-        </w:tc>
-        <w:tc>
-          <w:tcPr>
-            <w:tcW w:w="3529" w:type="dxa"/>
-          </w:tcPr>
-          <w:p>
-            <w:pPr>
-              <w:rPr>
-                <w:sz w:val="22"/>
-                <w:szCs w:val="22"/>
-              </w:rPr>
-            </w:pPr>
-            <w:proofErr w:type="spellStart"/>
-            <w:r>
-              <w:rPr>
-                <w:sz w:val="22"/>
-                <w:szCs w:val="22"/>
+          </w:p>
+        </w:tc>
+        <w:tc>
+          <w:tcPr>
+            <w:tcW w:w="3339" w:type="dxa"/>
+          </w:tcPr>
+          <w:p>
+            <w:pPr>
+              <w:rPr>
+                <w:sz w:val="18"/>
+                <w:szCs w:val="18"/>
+              </w:rPr>
+            </w:pPr>
+            <w:r>
+              <w:rPr>
+                <w:sz w:val="18"/>
+                <w:szCs w:val="18"/>
               </w:rPr>
               <w:t>updateUserSchema</w:t>
             </w:r>
-            <w:proofErr w:type="spellEnd"/>
-          </w:p>
-        </w:tc>
-        <w:tc>
-          <w:tcPr>
-            <w:tcW w:w="3636" w:type="dxa"/>
-          </w:tcPr>
-          <w:p>
-            <w:pPr>
-              <w:rPr>
-                <w:sz w:val="22"/>
-                <w:szCs w:val="22"/>
-              </w:rPr>
-            </w:pPr>
-            <w:proofErr w:type="spellStart"/>
-            <w:r>
-              <w:rPr>
-                <w:sz w:val="22"/>
-                <w:szCs w:val="22"/>
+          </w:p>
+        </w:tc>
+        <w:tc>
+          <w:tcPr>
+            <w:tcW w:w="3439" w:type="dxa"/>
+          </w:tcPr>
+          <w:p>
+            <w:pPr>
+              <w:rPr>
+                <w:sz w:val="18"/>
+                <w:szCs w:val="18"/>
+              </w:rPr>
+            </w:pPr>
+            <w:r>
+              <w:rPr>
+                <w:sz w:val="18"/>
+                <w:szCs w:val="18"/>
               </w:rPr>
               <w:t>userResponseGenericSchema</w:t>
             </w:r>
-            <w:proofErr w:type="spellEnd"/>
           </w:p>
         </w:tc>
       </w:tr>
       <w:tr>
         <w:tc>
           <w:tcPr>
-            <w:tcW w:w="2185" w:type="dxa"/>
-          </w:tcPr>
-          <w:p>
-            <w:pPr>
-              <w:rPr>
-                <w:sz w:val="22"/>
-                <w:szCs w:val="22"/>
-              </w:rPr>
-            </w:pPr>
-            <w:proofErr w:type="spellStart"/>
-            <w:r>
-              <w:rPr>
-                <w:sz w:val="22"/>
-                <w:szCs w:val="22"/>
+            <w:tcW w:w="2572" w:type="dxa"/>
+          </w:tcPr>
+          <w:p>
+            <w:pPr>
+              <w:rPr>
+                <w:sz w:val="18"/>
+                <w:szCs w:val="18"/>
+              </w:rPr>
+            </w:pPr>
+            <w:r>
+              <w:rPr>
+                <w:sz w:val="18"/>
+                <w:szCs w:val="18"/>
               </w:rPr>
               <w:t>updateUserPassword</w:t>
             </w:r>
-            <w:proofErr w:type="spellEnd"/>
-          </w:p>
-        </w:tc>
-        <w:tc>
-          <w:tcPr>
-            <w:tcW w:w="3529" w:type="dxa"/>
-          </w:tcPr>
-          <w:p>
-            <w:pPr>
-              <w:rPr>
-                <w:sz w:val="22"/>
-                <w:szCs w:val="22"/>
-              </w:rPr>
-            </w:pPr>
-            <w:proofErr w:type="spellStart"/>
-            <w:r>
-              <w:rPr>
-                <w:sz w:val="22"/>
-                <w:szCs w:val="22"/>
+          </w:p>
+        </w:tc>
+        <w:tc>
+          <w:tcPr>
+            <w:tcW w:w="3339" w:type="dxa"/>
+          </w:tcPr>
+          <w:p>
+            <w:pPr>
+              <w:rPr>
+                <w:sz w:val="18"/>
+                <w:szCs w:val="18"/>
+              </w:rPr>
+            </w:pPr>
+            <w:r>
+              <w:rPr>
+                <w:sz w:val="18"/>
+                <w:szCs w:val="18"/>
               </w:rPr>
               <w:t>updateUserPasswordSchema</w:t>
             </w:r>
-            <w:proofErr w:type="spellEnd"/>
-          </w:p>
-        </w:tc>
-        <w:tc>
-          <w:tcPr>
-            <w:tcW w:w="3636" w:type="dxa"/>
-          </w:tcPr>
-          <w:p>
-            <w:pPr>
-              <w:rPr>
-                <w:sz w:val="22"/>
-                <w:szCs w:val="22"/>
-              </w:rPr>
-            </w:pPr>
-            <w:proofErr w:type="spellStart"/>
-            <w:r>
-              <w:rPr>
-                <w:sz w:val="22"/>
-                <w:szCs w:val="22"/>
+          </w:p>
+        </w:tc>
+        <w:tc>
+          <w:tcPr>
+            <w:tcW w:w="3439" w:type="dxa"/>
+          </w:tcPr>
+          <w:p>
+            <w:pPr>
+              <w:rPr>
+                <w:sz w:val="18"/>
+                <w:szCs w:val="18"/>
+              </w:rPr>
+            </w:pPr>
+            <w:r>
+              <w:rPr>
+                <w:sz w:val="18"/>
+                <w:szCs w:val="18"/>
               </w:rPr>
               <w:t>userResponseGenericSchema</w:t>
             </w:r>
-            <w:proofErr w:type="spellEnd"/>
           </w:p>
         </w:tc>
       </w:tr>
       <w:tr>
         <w:tc>
           <w:tcPr>
-            <w:tcW w:w="2185" w:type="dxa"/>
-          </w:tcPr>
-          <w:p>
-            <w:pPr>
-              <w:rPr>
-                <w:sz w:val="22"/>
-                <w:szCs w:val="22"/>
-              </w:rPr>
-            </w:pPr>
-            <w:proofErr w:type="spellStart"/>
-            <w:r>
-              <w:rPr>
-                <w:sz w:val="22"/>
-                <w:szCs w:val="22"/>
+            <w:tcW w:w="2572" w:type="dxa"/>
+          </w:tcPr>
+          <w:p>
+            <w:pPr>
+              <w:rPr>
+                <w:sz w:val="18"/>
+                <w:szCs w:val="18"/>
+              </w:rPr>
+            </w:pPr>
+            <w:r>
+              <w:rPr>
+                <w:sz w:val="18"/>
+                <w:szCs w:val="18"/>
               </w:rPr>
               <w:t>getUserById</w:t>
             </w:r>
-            <w:proofErr w:type="spellEnd"/>
-          </w:p>
-        </w:tc>
-        <w:tc>
-          <w:tcPr>
-            <w:tcW w:w="3529" w:type="dxa"/>
-          </w:tcPr>
-          <w:p>
-            <w:pPr>
-              <w:rPr>
-                <w:sz w:val="22"/>
-                <w:szCs w:val="22"/>
-              </w:rPr>
-            </w:pPr>
-            <w:proofErr w:type="spellStart"/>
-            <w:r>
-              <w:rPr>
-                <w:sz w:val="22"/>
-                <w:szCs w:val="22"/>
+          </w:p>
+        </w:tc>
+        <w:tc>
+          <w:tcPr>
+            <w:tcW w:w="3339" w:type="dxa"/>
+          </w:tcPr>
+          <w:p>
+            <w:pPr>
+              <w:rPr>
+                <w:sz w:val="18"/>
+                <w:szCs w:val="18"/>
+              </w:rPr>
+            </w:pPr>
+            <w:r>
+              <w:rPr>
+                <w:sz w:val="18"/>
+                <w:szCs w:val="18"/>
               </w:rPr>
               <w:t>getUserByIdSchema</w:t>
             </w:r>
-            <w:proofErr w:type="spellEnd"/>
-          </w:p>
-        </w:tc>
-        <w:tc>
-          <w:tcPr>
-            <w:tcW w:w="3636" w:type="dxa"/>
-          </w:tcPr>
-          <w:p>
-            <w:pPr>
-              <w:rPr>
-                <w:sz w:val="22"/>
-                <w:szCs w:val="22"/>
-              </w:rPr>
-            </w:pPr>
-            <w:proofErr w:type="spellStart"/>
-            <w:r>
-              <w:rPr>
-                <w:sz w:val="22"/>
-                <w:szCs w:val="22"/>
+          </w:p>
+        </w:tc>
+        <w:tc>
+          <w:tcPr>
+            <w:tcW w:w="3439" w:type="dxa"/>
+          </w:tcPr>
+          <w:p>
+            <w:pPr>
+              <w:rPr>
+                <w:sz w:val="18"/>
+                <w:szCs w:val="18"/>
+              </w:rPr>
+            </w:pPr>
+            <w:r>
+              <w:rPr>
+                <w:sz w:val="18"/>
+                <w:szCs w:val="18"/>
               </w:rPr>
               <w:t>userResponseGenericSchema</w:t>
             </w:r>
-            <w:proofErr w:type="spellEnd"/>
           </w:p>
         </w:tc>
       </w:tr>
       <w:tr>
         <w:tc>
           <w:tcPr>
-            <w:tcW w:w="2185" w:type="dxa"/>
-          </w:tcPr>
-          <w:p>
-            <w:pPr>
-              <w:rPr>
-                <w:sz w:val="22"/>
-                <w:szCs w:val="22"/>
-              </w:rPr>
-            </w:pPr>
-            <w:proofErr w:type="spellStart"/>
-            <w:r>
-              <w:rPr>
-                <w:sz w:val="22"/>
-                <w:szCs w:val="22"/>
+            <w:tcW w:w="2572" w:type="dxa"/>
+          </w:tcPr>
+          <w:p>
+            <w:pPr>
+              <w:rPr>
+                <w:sz w:val="18"/>
+                <w:szCs w:val="18"/>
+              </w:rPr>
+            </w:pPr>
+            <w:r>
+              <w:rPr>
+                <w:sz w:val="18"/>
+                <w:szCs w:val="18"/>
               </w:rPr>
               <w:t>searchUsersByName</w:t>
             </w:r>
-            <w:proofErr w:type="spellEnd"/>
-          </w:p>
-        </w:tc>
-        <w:tc>
-          <w:tcPr>
-            <w:tcW w:w="3529" w:type="dxa"/>
-          </w:tcPr>
-          <w:p>
-            <w:pPr>
-              <w:rPr>
-                <w:sz w:val="22"/>
-                <w:szCs w:val="22"/>
-              </w:rPr>
-            </w:pPr>
-            <w:proofErr w:type="spellStart"/>
-            <w:r>
-              <w:rPr>
-                <w:sz w:val="22"/>
-                <w:szCs w:val="22"/>
+          </w:p>
+        </w:tc>
+        <w:tc>
+          <w:tcPr>
+            <w:tcW w:w="3339" w:type="dxa"/>
+          </w:tcPr>
+          <w:p>
+            <w:pPr>
+              <w:rPr>
+                <w:sz w:val="18"/>
+                <w:szCs w:val="18"/>
+              </w:rPr>
+            </w:pPr>
+            <w:r>
+              <w:rPr>
+                <w:sz w:val="18"/>
+                <w:szCs w:val="18"/>
               </w:rPr>
               <w:t>getUsersByNameSchema</w:t>
             </w:r>
-            <w:proofErr w:type="spellEnd"/>
-          </w:p>
-        </w:tc>
-        <w:tc>
-          <w:tcPr>
-            <w:tcW w:w="3636" w:type="dxa"/>
-          </w:tcPr>
-          <w:p>
-            <w:pPr>
-              <w:rPr>
-                <w:sz w:val="22"/>
-                <w:szCs w:val="22"/>
-              </w:rPr>
-            </w:pPr>
-            <w:proofErr w:type="spellStart"/>
-            <w:r>
-              <w:rPr>
-                <w:sz w:val="22"/>
-                <w:szCs w:val="22"/>
+          </w:p>
+        </w:tc>
+        <w:tc>
+          <w:tcPr>
+            <w:tcW w:w="3439" w:type="dxa"/>
+          </w:tcPr>
+          <w:p>
+            <w:pPr>
+              <w:rPr>
+                <w:sz w:val="18"/>
+                <w:szCs w:val="18"/>
+              </w:rPr>
+            </w:pPr>
+            <w:r>
+              <w:rPr>
+                <w:sz w:val="18"/>
+                <w:szCs w:val="18"/>
               </w:rPr>
               <w:t>userResponseGenericSchemaArray</w:t>
             </w:r>
-            <w:proofErr w:type="spellEnd"/>
           </w:p>
         </w:tc>
       </w:tr>
       <w:tr>
         <w:tc>
           <w:tcPr>
-            <w:tcW w:w="2185" w:type="dxa"/>
-          </w:tcPr>
-          <w:p>
-            <w:pPr>
-              <w:rPr>
-                <w:sz w:val="22"/>
-                <w:szCs w:val="22"/>
-              </w:rPr>
-            </w:pPr>
-            <w:proofErr w:type="spellStart"/>
-            <w:r>
-              <w:rPr>
-                <w:sz w:val="22"/>
-                <w:szCs w:val="22"/>
+            <w:tcW w:w="2572" w:type="dxa"/>
+          </w:tcPr>
+          <w:p>
+            <w:pPr>
+              <w:rPr>
+                <w:sz w:val="18"/>
+                <w:szCs w:val="18"/>
+              </w:rPr>
+            </w:pPr>
+            <w:r>
+              <w:rPr>
+                <w:sz w:val="18"/>
+                <w:szCs w:val="18"/>
               </w:rPr>
               <w:t>createShippingAddress</w:t>
             </w:r>
-            <w:proofErr w:type="spellEnd"/>
-          </w:p>
-        </w:tc>
-        <w:tc>
-          <w:tcPr>
-            <w:tcW w:w="3529" w:type="dxa"/>
-          </w:tcPr>
-          <w:p>
-            <w:pPr>
-              <w:rPr>
-                <w:sz w:val="22"/>
-                <w:szCs w:val="22"/>
-              </w:rPr>
-            </w:pPr>
-            <w:proofErr w:type="spellStart"/>
-            <w:r>
-              <w:rPr>
-                <w:sz w:val="22"/>
-                <w:szCs w:val="22"/>
+          </w:p>
+        </w:tc>
+        <w:tc>
+          <w:tcPr>
+            <w:tcW w:w="3339" w:type="dxa"/>
+          </w:tcPr>
+          <w:p>
+            <w:pPr>
+              <w:rPr>
+                <w:sz w:val="18"/>
+                <w:szCs w:val="18"/>
+              </w:rPr>
+            </w:pPr>
+            <w:r>
+              <w:rPr>
+                <w:sz w:val="18"/>
+                <w:szCs w:val="18"/>
               </w:rPr>
               <w:t>createShippingAddressRequestSchema</w:t>
             </w:r>
-            <w:proofErr w:type="spellEnd"/>
-          </w:p>
-        </w:tc>
-        <w:tc>
-          <w:tcPr>
-            <w:tcW w:w="3636" w:type="dxa"/>
-          </w:tcPr>
-          <w:p>
-            <w:pPr>
-              <w:rPr>
-                <w:sz w:val="22"/>
-                <w:szCs w:val="22"/>
-              </w:rPr>
-            </w:pPr>
-            <w:proofErr w:type="spellStart"/>
-            <w:r>
-              <w:rPr>
-                <w:sz w:val="22"/>
-                <w:szCs w:val="22"/>
+          </w:p>
+        </w:tc>
+        <w:tc>
+          <w:tcPr>
+            <w:tcW w:w="3439" w:type="dxa"/>
+          </w:tcPr>
+          <w:p>
+            <w:pPr>
+              <w:rPr>
+                <w:sz w:val="18"/>
+                <w:szCs w:val="18"/>
+              </w:rPr>
+            </w:pPr>
+            <w:r>
+              <w:rPr>
+                <w:sz w:val="18"/>
+                <w:szCs w:val="18"/>
               </w:rPr>
               <w:t>userShippingAddressResponseSchema</w:t>
             </w:r>
-            <w:proofErr w:type="spellEnd"/>
           </w:p>
         </w:tc>
       </w:tr>
       <w:tr>
         <w:tc>
           <w:tcPr>
-            <w:tcW w:w="2185" w:type="dxa"/>
-          </w:tcPr>
-          <w:p>
-            <w:pPr>
-              <w:rPr>
-                <w:sz w:val="22"/>
-                <w:szCs w:val="22"/>
-              </w:rPr>
-            </w:pPr>
-            <w:proofErr w:type="spellStart"/>
-            <w:r>
-              <w:rPr>
-                <w:sz w:val="22"/>
-                <w:szCs w:val="22"/>
+            <w:tcW w:w="2572" w:type="dxa"/>
+          </w:tcPr>
+          <w:p>
+            <w:pPr>
+              <w:rPr>
+                <w:sz w:val="18"/>
+                <w:szCs w:val="18"/>
+              </w:rPr>
+            </w:pPr>
+            <w:r>
+              <w:rPr>
+                <w:sz w:val="18"/>
+                <w:szCs w:val="18"/>
               </w:rPr>
               <w:t>updateShippingAddress</w:t>
             </w:r>
-            <w:proofErr w:type="spellEnd"/>
-          </w:p>
-        </w:tc>
-        <w:tc>
-          <w:tcPr>
-            <w:tcW w:w="3529" w:type="dxa"/>
-          </w:tcPr>
-          <w:p>
-            <w:pPr>
-              <w:rPr>
-                <w:sz w:val="22"/>
-                <w:szCs w:val="22"/>
-              </w:rPr>
-            </w:pPr>
-            <w:proofErr w:type="spellStart"/>
-            <w:r>
-              <w:rPr>
-                <w:sz w:val="22"/>
-                <w:szCs w:val="22"/>
+          </w:p>
+        </w:tc>
+        <w:tc>
+          <w:tcPr>
+            <w:tcW w:w="3339" w:type="dxa"/>
+          </w:tcPr>
+          <w:p>
+            <w:pPr>
+              <w:rPr>
+                <w:sz w:val="18"/>
+                <w:szCs w:val="18"/>
+              </w:rPr>
+            </w:pPr>
+            <w:r>
+              <w:rPr>
+                <w:sz w:val="18"/>
+                <w:szCs w:val="18"/>
               </w:rPr>
               <w:t>updateShippingAddressRequestSchema</w:t>
             </w:r>
-            <w:proofErr w:type="spellEnd"/>
-          </w:p>
-        </w:tc>
-        <w:tc>
-          <w:tcPr>
-            <w:tcW w:w="3636" w:type="dxa"/>
-          </w:tcPr>
-          <w:p>
-            <w:pPr>
-              <w:rPr>
-                <w:sz w:val="22"/>
-                <w:szCs w:val="22"/>
-              </w:rPr>
-            </w:pPr>
-            <w:proofErr w:type="spellStart"/>
-            <w:r>
-              <w:rPr>
-                <w:sz w:val="22"/>
-                <w:szCs w:val="22"/>
+          </w:p>
+        </w:tc>
+        <w:tc>
+          <w:tcPr>
+            <w:tcW w:w="3439" w:type="dxa"/>
+          </w:tcPr>
+          <w:p>
+            <w:pPr>
+              <w:rPr>
+                <w:sz w:val="18"/>
+                <w:szCs w:val="18"/>
+              </w:rPr>
+            </w:pPr>
+            <w:r>
+              <w:rPr>
+                <w:sz w:val="18"/>
+                <w:szCs w:val="18"/>
               </w:rPr>
               <w:t>updateShippingAddressResponseSchema</w:t>
             </w:r>
-            <w:proofErr w:type="spellEnd"/>
           </w:p>
         </w:tc>
       </w:tr>
       <w:tr>
         <w:tc>
           <w:tcPr>
-            <w:tcW w:w="2185" w:type="dxa"/>
-          </w:tcPr>
-          <w:p>
-            <w:pPr>
-              <w:rPr>
-                <w:sz w:val="22"/>
-                <w:szCs w:val="22"/>
-              </w:rPr>
-            </w:pPr>
-            <w:proofErr w:type="spellStart"/>
-            <w:r>
-              <w:rPr>
-                <w:sz w:val="22"/>
-                <w:szCs w:val="22"/>
+            <w:tcW w:w="2572" w:type="dxa"/>
+          </w:tcPr>
+          <w:p>
+            <w:pPr>
+              <w:rPr>
+                <w:sz w:val="18"/>
+                <w:szCs w:val="18"/>
+              </w:rPr>
+            </w:pPr>
+            <w:r>
+              <w:rPr>
+                <w:sz w:val="18"/>
+                <w:szCs w:val="18"/>
               </w:rPr>
               <w:t>getShippingAddressById</w:t>
             </w:r>
-            <w:proofErr w:type="spellEnd"/>
-          </w:p>
-        </w:tc>
-        <w:tc>
-          <w:tcPr>
-            <w:tcW w:w="3529" w:type="dxa"/>
-          </w:tcPr>
-          <w:p>
-            <w:pPr>
-              <w:rPr>
-                <w:sz w:val="22"/>
-                <w:szCs w:val="22"/>
-              </w:rPr>
-            </w:pPr>
-            <w:proofErr w:type="spellStart"/>
-            <w:r>
-              <w:rPr>
-                <w:sz w:val="22"/>
-                <w:szCs w:val="22"/>
+          </w:p>
+        </w:tc>
+        <w:tc>
+          <w:tcPr>
+            <w:tcW w:w="3339" w:type="dxa"/>
+          </w:tcPr>
+          <w:p>
+            <w:pPr>
+              <w:rPr>
+                <w:sz w:val="18"/>
+                <w:szCs w:val="18"/>
+              </w:rPr>
+            </w:pPr>
+            <w:r>
+              <w:rPr>
+                <w:sz w:val="18"/>
+                <w:szCs w:val="18"/>
               </w:rPr>
               <w:t>getShippingAddressByIdRequestSchema</w:t>
             </w:r>
-            <w:proofErr w:type="spellEnd"/>
-          </w:p>
-        </w:tc>
-        <w:tc>
-          <w:tcPr>
-            <w:tcW w:w="3636" w:type="dxa"/>
-          </w:tcPr>
-          <w:p>
-            <w:pPr>
-              <w:rPr>
-                <w:sz w:val="22"/>
-                <w:szCs w:val="22"/>
-              </w:rPr>
-            </w:pPr>
-            <w:proofErr w:type="spellStart"/>
-            <w:r>
-              <w:rPr>
-                <w:sz w:val="22"/>
-                <w:szCs w:val="22"/>
+          </w:p>
+        </w:tc>
+        <w:tc>
+          <w:tcPr>
+            <w:tcW w:w="3439" w:type="dxa"/>
+          </w:tcPr>
+          <w:p>
+            <w:pPr>
+              <w:rPr>
+                <w:sz w:val="18"/>
+                <w:szCs w:val="18"/>
+              </w:rPr>
+            </w:pPr>
+            <w:r>
+              <w:rPr>
+                <w:sz w:val="18"/>
+                <w:szCs w:val="18"/>
               </w:rPr>
               <w:t>shippingAddressStandardSchema</w:t>
             </w:r>
-            <w:proofErr w:type="spellEnd"/>
           </w:p>
         </w:tc>
       </w:tr>
       <w:tr>
         <w:tc>
           <w:tcPr>
-            <w:tcW w:w="2185" w:type="dxa"/>
-          </w:tcPr>
-          <w:p>
-            <w:pPr>
-              <w:rPr>
-                <w:sz w:val="22"/>
-                <w:szCs w:val="22"/>
-              </w:rPr>
-            </w:pPr>
-            <w:proofErr w:type="spellStart"/>
-            <w:r>
-              <w:rPr>
-                <w:sz w:val="22"/>
-                <w:szCs w:val="22"/>
+            <w:tcW w:w="2572" w:type="dxa"/>
+          </w:tcPr>
+          <w:p>
+            <w:pPr>
+              <w:rPr>
+                <w:sz w:val="18"/>
+                <w:szCs w:val="18"/>
+              </w:rPr>
+            </w:pPr>
+            <w:r>
+              <w:rPr>
+                <w:sz w:val="18"/>
+                <w:szCs w:val="18"/>
               </w:rPr>
               <w:t>deleteShippingAddressById</w:t>
             </w:r>
-            <w:proofErr w:type="spellEnd"/>
-          </w:p>
-        </w:tc>
-        <w:tc>
-          <w:tcPr>
-            <w:tcW w:w="3529" w:type="dxa"/>
-          </w:tcPr>
-          <w:p>
-            <w:pPr>
-              <w:rPr>
-                <w:sz w:val="22"/>
-                <w:szCs w:val="22"/>
-              </w:rPr>
-            </w:pPr>
-            <w:proofErr w:type="spellStart"/>
-            <w:r>
-              <w:rPr>
-                <w:sz w:val="22"/>
-                <w:szCs w:val="22"/>
+          </w:p>
+        </w:tc>
+        <w:tc>
+          <w:tcPr>
+            <w:tcW w:w="3339" w:type="dxa"/>
+          </w:tcPr>
+          <w:p>
+            <w:pPr>
+              <w:rPr>
+                <w:sz w:val="18"/>
+                <w:szCs w:val="18"/>
+              </w:rPr>
+            </w:pPr>
+            <w:r>
+              <w:rPr>
+                <w:sz w:val="18"/>
+                <w:szCs w:val="18"/>
               </w:rPr>
               <w:t>getShippingAddressByIdRequestSchema</w:t>
             </w:r>
-            <w:proofErr w:type="spellEnd"/>
-          </w:p>
-        </w:tc>
-        <w:tc>
-          <w:tcPr>
-            <w:tcW w:w="3636" w:type="dxa"/>
-          </w:tcPr>
-          <w:p>
-            <w:pPr>
-              <w:rPr>
-                <w:sz w:val="22"/>
-                <w:szCs w:val="22"/>
-              </w:rPr>
-            </w:pPr>
-            <w:proofErr w:type="spellStart"/>
-            <w:r>
-              <w:rPr>
-                <w:sz w:val="22"/>
-                <w:szCs w:val="22"/>
+          </w:p>
+        </w:tc>
+        <w:tc>
+          <w:tcPr>
+            <w:tcW w:w="3439" w:type="dxa"/>
+          </w:tcPr>
+          <w:p>
+            <w:pPr>
+              <w:rPr>
+                <w:sz w:val="18"/>
+                <w:szCs w:val="18"/>
+              </w:rPr>
+            </w:pPr>
+            <w:r>
+              <w:rPr>
+                <w:sz w:val="18"/>
+                <w:szCs w:val="18"/>
               </w:rPr>
               <w:t>updateShippingAddressResponseSchema</w:t>
             </w:r>
-            <w:proofErr w:type="spellEnd"/>
+          </w:p>
+        </w:tc>
+      </w:tr>
+      <w:tr>
+        <w:tc>
+          <w:tcPr>
+            <w:tcW w:w="2572" w:type="dxa"/>
+          </w:tcPr>
+          <w:p>
+            <w:pPr>
+              <w:rPr>
+                <w:sz w:val="18"/>
+                <w:szCs w:val="18"/>
+              </w:rPr>
+            </w:pPr>
+            <w:r>
+              <w:rPr>
+                <w:sz w:val="18"/>
+                <w:szCs w:val="18"/>
+              </w:rPr>
+              <w:t>createCartItem</w:t>
+            </w:r>
+          </w:p>
+        </w:tc>
+        <w:tc>
+          <w:tcPr>
+            <w:tcW w:w="3339" w:type="dxa"/>
+          </w:tcPr>
+          <w:p>
+            <w:pPr>
+              <w:rPr>
+                <w:sz w:val="18"/>
+                <w:szCs w:val="18"/>
+              </w:rPr>
+            </w:pPr>
+            <w:r>
+              <w:rPr>
+                <w:sz w:val="18"/>
+                <w:szCs w:val="18"/>
+              </w:rPr>
+              <w:t>cartItemRequestSchema</w:t>
+            </w:r>
+          </w:p>
+        </w:tc>
+        <w:tc>
+          <w:tcPr>
+            <w:tcW w:w="3439" w:type="dxa"/>
+          </w:tcPr>
+          <w:p>
+            <w:pPr>
+              <w:rPr>
+                <w:sz w:val="18"/>
+                <w:szCs w:val="18"/>
+              </w:rPr>
+            </w:pPr>
+            <w:r>
+              <w:rPr>
+                <w:sz w:val="18"/>
+                <w:szCs w:val="18"/>
+              </w:rPr>
+              <w:t>-</w:t>
+            </w:r>
+          </w:p>
+        </w:tc>
+      </w:tr>
+      <w:tr>
+        <w:tc>
+          <w:tcPr>
+            <w:tcW w:w="2572" w:type="dxa"/>
+          </w:tcPr>
+          <w:p>
+            <w:pPr>
+              <w:rPr>
+                <w:sz w:val="18"/>
+                <w:szCs w:val="18"/>
+              </w:rPr>
+            </w:pPr>
+            <w:r>
+              <w:rPr>
+                <w:sz w:val="18"/>
+                <w:szCs w:val="18"/>
+              </w:rPr>
+              <w:t>createProduct</w:t>
+            </w:r>
+          </w:p>
+        </w:tc>
+        <w:tc>
+          <w:tcPr>
+            <w:tcW w:w="3339" w:type="dxa"/>
+          </w:tcPr>
+          <w:p>
+            <w:pPr>
+              <w:rPr>
+                <w:sz w:val="18"/>
+                <w:szCs w:val="18"/>
+              </w:rPr>
+            </w:pPr>
+            <w:r>
+              <w:rPr>
+                <w:sz w:val="18"/>
+                <w:szCs w:val="18"/>
+              </w:rPr>
+              <w:t>productRequestSchema</w:t>
+            </w:r>
+          </w:p>
+        </w:tc>
+        <w:tc>
+          <w:tcPr>
+            <w:tcW w:w="3439" w:type="dxa"/>
+          </w:tcPr>
+          <w:p>
+            <w:pPr>
+              <w:rPr>
+                <w:sz w:val="18"/>
+                <w:szCs w:val="18"/>
+              </w:rPr>
+            </w:pPr>
+            <w:r>
+              <w:rPr>
+                <w:sz w:val="18"/>
+                <w:szCs w:val="18"/>
+              </w:rPr>
+              <w:t>productResponseSchema</w:t>
+            </w:r>
+          </w:p>
+        </w:tc>
+      </w:tr>
+      <w:tr>
+        <w:tc>
+          <w:tcPr>
+            <w:tcW w:w="2572" w:type="dxa"/>
+          </w:tcPr>
+          <w:p>
+            <w:pPr>
+              <w:rPr>
+                <w:sz w:val="18"/>
+                <w:szCs w:val="18"/>
+              </w:rPr>
+            </w:pPr>
+            <w:r>
+              <w:rPr>
+                <w:sz w:val="18"/>
+                <w:szCs w:val="18"/>
+              </w:rPr>
+              <w:t>updateProductPrice</w:t>
+            </w:r>
+          </w:p>
+        </w:tc>
+        <w:tc>
+          <w:tcPr>
+            <w:tcW w:w="3339" w:type="dxa"/>
+          </w:tcPr>
+          <w:p>
+            <w:pPr>
+              <w:rPr>
+                <w:sz w:val="18"/>
+                <w:szCs w:val="18"/>
+              </w:rPr>
+            </w:pPr>
+            <w:r>
+              <w:rPr>
+                <w:sz w:val="18"/>
+                <w:szCs w:val="18"/>
+              </w:rPr>
+              <w:t>updateProductPriceSchema</w:t>
+            </w:r>
+          </w:p>
+        </w:tc>
+        <w:tc>
+          <w:tcPr>
+            <w:tcW w:w="3439" w:type="dxa"/>
+          </w:tcPr>
+          <w:p>
+            <w:pPr>
+              <w:rPr>
+                <w:sz w:val="18"/>
+                <w:szCs w:val="18"/>
+              </w:rPr>
+            </w:pPr>
+            <w:r>
+              <w:rPr>
+                <w:sz w:val="18"/>
+                <w:szCs w:val="18"/>
+              </w:rPr>
+              <w:t>updateProductResponseSchema</w:t>
+            </w:r>
+          </w:p>
+        </w:tc>
+      </w:tr>
+      <w:tr>
+        <w:tc>
+          <w:tcPr>
+            <w:tcW w:w="2572" w:type="dxa"/>
+          </w:tcPr>
+          <w:p>
+            <w:pPr>
+              <w:rPr>
+                <w:sz w:val="18"/>
+                <w:szCs w:val="18"/>
+              </w:rPr>
+            </w:pPr>
+            <w:r>
+              <w:rPr>
+                <w:sz w:val="18"/>
+                <w:szCs w:val="18"/>
+              </w:rPr>
+              <w:t>updateProduct</w:t>
+            </w:r>
+          </w:p>
+        </w:tc>
+        <w:tc>
+          <w:tcPr>
+            <w:tcW w:w="3339" w:type="dxa"/>
+          </w:tcPr>
+          <w:p>
+            <w:pPr>
+              <w:rPr>
+                <w:sz w:val="18"/>
+                <w:szCs w:val="18"/>
+              </w:rPr>
+            </w:pPr>
+            <w:r>
+              <w:rPr>
+                <w:sz w:val="18"/>
+                <w:szCs w:val="18"/>
+              </w:rPr>
+              <w:t>updateProductSchema</w:t>
+            </w:r>
+          </w:p>
+        </w:tc>
+        <w:tc>
+          <w:tcPr>
+            <w:tcW w:w="3439" w:type="dxa"/>
+          </w:tcPr>
+          <w:p>
+            <w:pPr>
+              <w:rPr>
+                <w:sz w:val="18"/>
+                <w:szCs w:val="18"/>
+              </w:rPr>
+            </w:pPr>
+            <w:r>
+              <w:rPr>
+                <w:sz w:val="18"/>
+                <w:szCs w:val="18"/>
+              </w:rPr>
+              <w:t>updateProductResponseSchema</w:t>
+            </w:r>
+          </w:p>
+        </w:tc>
+      </w:tr>
+      <w:tr>
+        <w:tc>
+          <w:tcPr>
+            <w:tcW w:w="2572" w:type="dxa"/>
+          </w:tcPr>
+          <w:p>
+            <w:pPr>
+              <w:rPr>
+                <w:sz w:val="18"/>
+                <w:szCs w:val="18"/>
+              </w:rPr>
+            </w:pPr>
+            <w:r>
+              <w:rPr>
+                <w:sz w:val="18"/>
+                <w:szCs w:val="18"/>
+              </w:rPr>
+              <w:t>updateProductGarmentWeight</w:t>
+            </w:r>
+          </w:p>
+        </w:tc>
+        <w:tc>
+          <w:tcPr>
+            <w:tcW w:w="3339" w:type="dxa"/>
+          </w:tcPr>
+          <w:p>
+            <w:pPr>
+              <w:rPr>
+                <w:sz w:val="18"/>
+                <w:szCs w:val="18"/>
+              </w:rPr>
+            </w:pPr>
+            <w:r>
+              <w:rPr>
+                <w:sz w:val="18"/>
+                <w:szCs w:val="18"/>
+              </w:rPr>
+              <w:t>productGarmentWeightSchema</w:t>
+            </w:r>
+          </w:p>
+        </w:tc>
+        <w:tc>
+          <w:tcPr>
+            <w:tcW w:w="3439" w:type="dxa"/>
+          </w:tcPr>
+          <w:p>
+            <w:pPr>
+              <w:rPr>
+                <w:sz w:val="18"/>
+                <w:szCs w:val="18"/>
+              </w:rPr>
+            </w:pPr>
+            <w:r>
+              <w:rPr>
+                <w:sz w:val="18"/>
+                <w:szCs w:val="18"/>
+              </w:rPr>
+              <w:t>updateProductResponseSchema</w:t>
+            </w:r>
+          </w:p>
+        </w:tc>
+      </w:tr>
+      <w:tr>
+        <w:tc>
+          <w:tcPr>
+            <w:tcW w:w="2572" w:type="dxa"/>
+          </w:tcPr>
+          <w:p>
+            <w:pPr>
+              <w:rPr>
+                <w:sz w:val="18"/>
+                <w:szCs w:val="18"/>
+              </w:rPr>
+            </w:pPr>
+            <w:r>
+              <w:rPr>
+                <w:sz w:val="18"/>
+                <w:szCs w:val="18"/>
+              </w:rPr>
+              <w:t>updateProductSupplyType</w:t>
+            </w:r>
+          </w:p>
+        </w:tc>
+        <w:tc>
+          <w:tcPr>
+            <w:tcW w:w="3339" w:type="dxa"/>
+          </w:tcPr>
+          <w:p>
+            <w:pPr>
+              <w:rPr>
+                <w:sz w:val="18"/>
+                <w:szCs w:val="18"/>
+              </w:rPr>
+            </w:pPr>
+            <w:r>
+              <w:rPr>
+                <w:sz w:val="18"/>
+                <w:szCs w:val="18"/>
+              </w:rPr>
+              <w:t>productSupplyTypeSchema</w:t>
+            </w:r>
+          </w:p>
+        </w:tc>
+        <w:tc>
+          <w:tcPr>
+            <w:tcW w:w="3439" w:type="dxa"/>
+          </w:tcPr>
+          <w:p>
+            <w:pPr>
+              <w:rPr>
+                <w:sz w:val="18"/>
+                <w:szCs w:val="18"/>
+              </w:rPr>
+            </w:pPr>
+            <w:r>
+              <w:rPr>
+                <w:sz w:val="18"/>
+                <w:szCs w:val="18"/>
+              </w:rPr>
+              <w:t>updateProductResponseSchema</w:t>
+            </w:r>
+          </w:p>
+        </w:tc>
+      </w:tr>
+      <w:tr>
+        <w:tc>
+          <w:tcPr>
+            <w:tcW w:w="2572" w:type="dxa"/>
+          </w:tcPr>
+          <w:p>
+            <w:pPr>
+              <w:rPr>
+                <w:sz w:val="18"/>
+                <w:szCs w:val="18"/>
+              </w:rPr>
+            </w:pPr>
+            <w:r>
+              <w:rPr>
+                <w:sz w:val="18"/>
+                <w:szCs w:val="18"/>
+              </w:rPr>
+              <w:t>searchProducts</w:t>
+            </w:r>
+          </w:p>
+        </w:tc>
+        <w:tc>
+          <w:tcPr>
+            <w:tcW w:w="3339" w:type="dxa"/>
+          </w:tcPr>
+          <w:p>
+            <w:pPr>
+              <w:rPr>
+                <w:sz w:val="18"/>
+                <w:szCs w:val="18"/>
+              </w:rPr>
+            </w:pPr>
+            <w:r>
+              <w:rPr>
+                <w:sz w:val="18"/>
+                <w:szCs w:val="18"/>
+              </w:rPr>
+              <w:t>searchProductSchema</w:t>
+            </w:r>
+          </w:p>
+        </w:tc>
+        <w:tc>
+          <w:tcPr>
+            <w:tcW w:w="3439" w:type="dxa"/>
+          </w:tcPr>
+          <w:p>
+            <w:pPr>
+              <w:rPr>
+                <w:sz w:val="18"/>
+                <w:szCs w:val="18"/>
+              </w:rPr>
+            </w:pPr>
+            <w:r>
+              <w:rPr>
+                <w:sz w:val="18"/>
+                <w:szCs w:val="18"/>
+              </w:rPr>
+              <w:t>searchProductArrayResponseSchema</w:t>
+            </w:r>
           </w:p>
         </w:tc>
       </w:tr>

</xml_diff>

<commit_message>
Updated the CartItems, ShippingAddresses and User Schema Compositions
</commit_message>
<xml_diff>
--- a/Website/Design_Documents/Relation_between_API_and_Schema.docx
+++ b/Website/Design_Documents/Relation_between_API_and_Schema.docx
@@ -100,6 +100,7 @@
                 <w:szCs w:val="18"/>
               </w:rPr>
             </w:pPr>
+            <w:proofErr w:type="spellStart"/>
             <w:r>
               <w:rPr>
                 <w:sz w:val="18"/>
@@ -107,6 +108,7 @@
               </w:rPr>
               <w:t>registerUser</w:t>
             </w:r>
+            <w:proofErr w:type="spellEnd"/>
           </w:p>
         </w:tc>
         <w:tc>
@@ -120,6 +122,7 @@
                 <w:szCs w:val="18"/>
               </w:rPr>
             </w:pPr>
+            <w:proofErr w:type="spellStart"/>
             <w:r>
               <w:rPr>
                 <w:sz w:val="18"/>
@@ -127,6 +130,7 @@
               </w:rPr>
               <w:t>userRequestSchema</w:t>
             </w:r>
+            <w:proofErr w:type="spellEnd"/>
           </w:p>
         </w:tc>
         <w:tc>
@@ -140,6 +144,7 @@
                 <w:szCs w:val="18"/>
               </w:rPr>
             </w:pPr>
+            <w:proofErr w:type="spellStart"/>
             <w:r>
               <w:rPr>
                 <w:sz w:val="18"/>
@@ -147,6 +152,7 @@
               </w:rPr>
               <w:t>registerUserResponseSchema</w:t>
             </w:r>
+            <w:proofErr w:type="spellEnd"/>
           </w:p>
         </w:tc>
       </w:tr>
@@ -162,6 +168,7 @@
                 <w:szCs w:val="18"/>
               </w:rPr>
             </w:pPr>
+            <w:proofErr w:type="spellStart"/>
             <w:r>
               <w:rPr>
                 <w:sz w:val="18"/>
@@ -169,6 +176,7 @@
               </w:rPr>
               <w:t>updateUser</w:t>
             </w:r>
+            <w:proofErr w:type="spellEnd"/>
           </w:p>
         </w:tc>
         <w:tc>
@@ -182,6 +190,7 @@
                 <w:szCs w:val="18"/>
               </w:rPr>
             </w:pPr>
+            <w:proofErr w:type="spellStart"/>
             <w:r>
               <w:rPr>
                 <w:sz w:val="18"/>
@@ -189,6 +198,7 @@
               </w:rPr>
               <w:t>updateUserSchema</w:t>
             </w:r>
+            <w:proofErr w:type="spellEnd"/>
           </w:p>
         </w:tc>
         <w:tc>
@@ -202,13 +212,15 @@
                 <w:szCs w:val="18"/>
               </w:rPr>
             </w:pPr>
-            <w:r>
-              <w:rPr>
-                <w:sz w:val="18"/>
-                <w:szCs w:val="18"/>
-              </w:rPr>
-              <w:t>userResponseGenericSchema</w:t>
-            </w:r>
+            <w:proofErr w:type="spellStart"/>
+            <w:r>
+              <w:rPr>
+                <w:sz w:val="18"/>
+                <w:szCs w:val="18"/>
+              </w:rPr>
+              <w:t>userResponseSchema</w:t>
+            </w:r>
+            <w:proofErr w:type="spellEnd"/>
           </w:p>
         </w:tc>
       </w:tr>
@@ -224,6 +236,7 @@
                 <w:szCs w:val="18"/>
               </w:rPr>
             </w:pPr>
+            <w:proofErr w:type="spellStart"/>
             <w:r>
               <w:rPr>
                 <w:sz w:val="18"/>
@@ -231,6 +244,7 @@
               </w:rPr>
               <w:t>updateUserPassword</w:t>
             </w:r>
+            <w:proofErr w:type="spellEnd"/>
           </w:p>
         </w:tc>
         <w:tc>
@@ -244,6 +258,7 @@
                 <w:szCs w:val="18"/>
               </w:rPr>
             </w:pPr>
+            <w:proofErr w:type="spellStart"/>
             <w:r>
               <w:rPr>
                 <w:sz w:val="18"/>
@@ -251,6 +266,7 @@
               </w:rPr>
               <w:t>updateUserPasswordSchema</w:t>
             </w:r>
+            <w:proofErr w:type="spellEnd"/>
           </w:p>
         </w:tc>
         <w:tc>
@@ -264,13 +280,15 @@
                 <w:szCs w:val="18"/>
               </w:rPr>
             </w:pPr>
-            <w:r>
-              <w:rPr>
-                <w:sz w:val="18"/>
-                <w:szCs w:val="18"/>
-              </w:rPr>
-              <w:t>userResponseGenericSchema</w:t>
-            </w:r>
+            <w:proofErr w:type="spellStart"/>
+            <w:r>
+              <w:rPr>
+                <w:sz w:val="18"/>
+                <w:szCs w:val="18"/>
+              </w:rPr>
+              <w:t>userResponseSchema</w:t>
+            </w:r>
+            <w:proofErr w:type="spellEnd"/>
           </w:p>
         </w:tc>
       </w:tr>
@@ -286,6 +304,7 @@
                 <w:szCs w:val="18"/>
               </w:rPr>
             </w:pPr>
+            <w:proofErr w:type="spellStart"/>
             <w:r>
               <w:rPr>
                 <w:sz w:val="18"/>
@@ -293,6 +312,7 @@
               </w:rPr>
               <w:t>getUserById</w:t>
             </w:r>
+            <w:proofErr w:type="spellEnd"/>
           </w:p>
         </w:tc>
         <w:tc>
@@ -306,6 +326,7 @@
                 <w:szCs w:val="18"/>
               </w:rPr>
             </w:pPr>
+            <w:proofErr w:type="spellStart"/>
             <w:r>
               <w:rPr>
                 <w:sz w:val="18"/>
@@ -313,6 +334,7 @@
               </w:rPr>
               <w:t>getUserByIdSchema</w:t>
             </w:r>
+            <w:proofErr w:type="spellEnd"/>
           </w:p>
         </w:tc>
         <w:tc>
@@ -326,13 +348,15 @@
                 <w:szCs w:val="18"/>
               </w:rPr>
             </w:pPr>
-            <w:r>
-              <w:rPr>
-                <w:sz w:val="18"/>
-                <w:szCs w:val="18"/>
-              </w:rPr>
-              <w:t>userResponseGenericSchema</w:t>
-            </w:r>
+            <w:proofErr w:type="spellStart"/>
+            <w:r>
+              <w:rPr>
+                <w:sz w:val="18"/>
+                <w:szCs w:val="18"/>
+              </w:rPr>
+              <w:t>userResponseSchema</w:t>
+            </w:r>
+            <w:proofErr w:type="spellEnd"/>
           </w:p>
         </w:tc>
       </w:tr>
@@ -348,6 +372,7 @@
                 <w:szCs w:val="18"/>
               </w:rPr>
             </w:pPr>
+            <w:proofErr w:type="spellStart"/>
             <w:r>
               <w:rPr>
                 <w:sz w:val="18"/>
@@ -355,6 +380,7 @@
               </w:rPr>
               <w:t>searchUsersByName</w:t>
             </w:r>
+            <w:proofErr w:type="spellEnd"/>
           </w:p>
         </w:tc>
         <w:tc>
@@ -368,6 +394,7 @@
                 <w:szCs w:val="18"/>
               </w:rPr>
             </w:pPr>
+            <w:proofErr w:type="spellStart"/>
             <w:r>
               <w:rPr>
                 <w:sz w:val="18"/>
@@ -375,6 +402,7 @@
               </w:rPr>
               <w:t>getUsersByNameSchema</w:t>
             </w:r>
+            <w:proofErr w:type="spellEnd"/>
           </w:p>
         </w:tc>
         <w:tc>
@@ -388,13 +416,15 @@
                 <w:szCs w:val="18"/>
               </w:rPr>
             </w:pPr>
-            <w:r>
-              <w:rPr>
-                <w:sz w:val="18"/>
-                <w:szCs w:val="18"/>
-              </w:rPr>
-              <w:t>userResponseGenericSchemaArray</w:t>
-            </w:r>
+            <w:proofErr w:type="spellStart"/>
+            <w:r>
+              <w:rPr>
+                <w:sz w:val="18"/>
+                <w:szCs w:val="18"/>
+              </w:rPr>
+              <w:t>userResponseSchemaArray</w:t>
+            </w:r>
+            <w:proofErr w:type="spellEnd"/>
           </w:p>
         </w:tc>
       </w:tr>
@@ -410,6 +440,7 @@
                 <w:szCs w:val="18"/>
               </w:rPr>
             </w:pPr>
+            <w:proofErr w:type="spellStart"/>
             <w:r>
               <w:rPr>
                 <w:sz w:val="18"/>
@@ -417,6 +448,7 @@
               </w:rPr>
               <w:t>createShippingAddress</w:t>
             </w:r>
+            <w:proofErr w:type="spellEnd"/>
           </w:p>
         </w:tc>
         <w:tc>
@@ -430,13 +462,22 @@
                 <w:szCs w:val="18"/>
               </w:rPr>
             </w:pPr>
-            <w:r>
-              <w:rPr>
-                <w:sz w:val="18"/>
-                <w:szCs w:val="18"/>
-              </w:rPr>
-              <w:t>createShippingAddressRequestSchema</w:t>
-            </w:r>
+            <w:proofErr w:type="spellStart"/>
+            <w:r>
+              <w:rPr>
+                <w:sz w:val="18"/>
+                <w:szCs w:val="18"/>
+              </w:rPr>
+              <w:t>s</w:t>
+            </w:r>
+            <w:r>
+              <w:rPr>
+                <w:sz w:val="18"/>
+                <w:szCs w:val="18"/>
+              </w:rPr>
+              <w:t>hippingAddressRequestSchema</w:t>
+            </w:r>
+            <w:proofErr w:type="spellEnd"/>
           </w:p>
         </w:tc>
         <w:tc>
@@ -450,13 +491,15 @@
                 <w:szCs w:val="18"/>
               </w:rPr>
             </w:pPr>
-            <w:r>
-              <w:rPr>
-                <w:sz w:val="18"/>
-                <w:szCs w:val="18"/>
-              </w:rPr>
-              <w:t>userShippingAddressResponseSchema</w:t>
-            </w:r>
+            <w:proofErr w:type="spellStart"/>
+            <w:r>
+              <w:rPr>
+                <w:sz w:val="18"/>
+                <w:szCs w:val="18"/>
+              </w:rPr>
+              <w:t>userResponseSchema</w:t>
+            </w:r>
+            <w:proofErr w:type="spellEnd"/>
           </w:p>
         </w:tc>
       </w:tr>
@@ -472,6 +515,7 @@
                 <w:szCs w:val="18"/>
               </w:rPr>
             </w:pPr>
+            <w:proofErr w:type="spellStart"/>
             <w:r>
               <w:rPr>
                 <w:sz w:val="18"/>
@@ -479,6 +523,7 @@
               </w:rPr>
               <w:t>updateShippingAddress</w:t>
             </w:r>
+            <w:proofErr w:type="spellEnd"/>
           </w:p>
         </w:tc>
         <w:tc>
@@ -492,6 +537,7 @@
                 <w:szCs w:val="18"/>
               </w:rPr>
             </w:pPr>
+            <w:proofErr w:type="spellStart"/>
             <w:r>
               <w:rPr>
                 <w:sz w:val="18"/>
@@ -499,6 +545,7 @@
               </w:rPr>
               <w:t>updateShippingAddressRequestSchema</w:t>
             </w:r>
+            <w:proofErr w:type="spellEnd"/>
           </w:p>
         </w:tc>
         <w:tc>
@@ -512,6 +559,7 @@
                 <w:szCs w:val="18"/>
               </w:rPr>
             </w:pPr>
+            <w:proofErr w:type="spellStart"/>
             <w:r>
               <w:rPr>
                 <w:sz w:val="18"/>
@@ -519,6 +567,7 @@
               </w:rPr>
               <w:t>updateShippingAddressResponseSchema</w:t>
             </w:r>
+            <w:proofErr w:type="spellEnd"/>
           </w:p>
         </w:tc>
       </w:tr>
@@ -534,6 +583,7 @@
                 <w:szCs w:val="18"/>
               </w:rPr>
             </w:pPr>
+            <w:proofErr w:type="spellStart"/>
             <w:r>
               <w:rPr>
                 <w:sz w:val="18"/>
@@ -541,6 +591,7 @@
               </w:rPr>
               <w:t>getShippingAddressById</w:t>
             </w:r>
+            <w:proofErr w:type="spellEnd"/>
           </w:p>
         </w:tc>
         <w:tc>
@@ -554,6 +605,7 @@
                 <w:szCs w:val="18"/>
               </w:rPr>
             </w:pPr>
+            <w:proofErr w:type="spellStart"/>
             <w:r>
               <w:rPr>
                 <w:sz w:val="18"/>
@@ -561,6 +613,7 @@
               </w:rPr>
               <w:t>getShippingAddressByIdRequestSchema</w:t>
             </w:r>
+            <w:proofErr w:type="spellEnd"/>
           </w:p>
         </w:tc>
         <w:tc>
@@ -574,13 +627,29 @@
                 <w:szCs w:val="18"/>
               </w:rPr>
             </w:pPr>
-            <w:r>
-              <w:rPr>
-                <w:sz w:val="18"/>
-                <w:szCs w:val="18"/>
-              </w:rPr>
-              <w:t>shippingAddressStandardSchema</w:t>
-            </w:r>
+            <w:proofErr w:type="spellStart"/>
+            <w:r>
+              <w:rPr>
+                <w:sz w:val="18"/>
+                <w:szCs w:val="18"/>
+              </w:rPr>
+              <w:t>shippingAddress</w:t>
+            </w:r>
+            <w:r>
+              <w:rPr>
+                <w:sz w:val="18"/>
+                <w:szCs w:val="18"/>
+              </w:rPr>
+              <w:t>Response</w:t>
+            </w:r>
+            <w:r>
+              <w:rPr>
+                <w:sz w:val="18"/>
+                <w:szCs w:val="18"/>
+              </w:rPr>
+              <w:t>Schema</w:t>
+            </w:r>
+            <w:proofErr w:type="spellEnd"/>
           </w:p>
         </w:tc>
       </w:tr>
@@ -596,6 +665,7 @@
                 <w:szCs w:val="18"/>
               </w:rPr>
             </w:pPr>
+            <w:proofErr w:type="spellStart"/>
             <w:r>
               <w:rPr>
                 <w:sz w:val="18"/>
@@ -603,6 +673,7 @@
               </w:rPr>
               <w:t>deleteShippingAddressById</w:t>
             </w:r>
+            <w:proofErr w:type="spellEnd"/>
           </w:p>
         </w:tc>
         <w:tc>
@@ -616,6 +687,7 @@
                 <w:szCs w:val="18"/>
               </w:rPr>
             </w:pPr>
+            <w:proofErr w:type="spellStart"/>
             <w:r>
               <w:rPr>
                 <w:sz w:val="18"/>
@@ -623,6 +695,7 @@
               </w:rPr>
               <w:t>getShippingAddressByIdRequestSchema</w:t>
             </w:r>
+            <w:proofErr w:type="spellEnd"/>
           </w:p>
         </w:tc>
         <w:tc>
@@ -636,6 +709,7 @@
                 <w:szCs w:val="18"/>
               </w:rPr>
             </w:pPr>
+            <w:proofErr w:type="spellStart"/>
             <w:r>
               <w:rPr>
                 <w:sz w:val="18"/>
@@ -643,6 +717,7 @@
               </w:rPr>
               <w:t>updateShippingAddressResponseSchema</w:t>
             </w:r>
+            <w:proofErr w:type="spellEnd"/>
           </w:p>
         </w:tc>
       </w:tr>
@@ -658,6 +733,7 @@
                 <w:szCs w:val="18"/>
               </w:rPr>
             </w:pPr>
+            <w:proofErr w:type="spellStart"/>
             <w:r>
               <w:rPr>
                 <w:sz w:val="18"/>
@@ -665,6 +741,7 @@
               </w:rPr>
               <w:t>createCartItem</w:t>
             </w:r>
+            <w:proofErr w:type="spellEnd"/>
           </w:p>
         </w:tc>
         <w:tc>
@@ -678,6 +755,7 @@
                 <w:szCs w:val="18"/>
               </w:rPr>
             </w:pPr>
+            <w:proofErr w:type="spellStart"/>
             <w:r>
               <w:rPr>
                 <w:sz w:val="18"/>
@@ -685,6 +763,7 @@
               </w:rPr>
               <w:t>cartItemRequestSchema</w:t>
             </w:r>
+            <w:proofErr w:type="spellEnd"/>
           </w:p>
         </w:tc>
         <w:tc>
@@ -720,6 +799,7 @@
                 <w:szCs w:val="18"/>
               </w:rPr>
             </w:pPr>
+            <w:proofErr w:type="spellStart"/>
             <w:r>
               <w:rPr>
                 <w:sz w:val="18"/>
@@ -727,6 +807,7 @@
               </w:rPr>
               <w:t>createProduct</w:t>
             </w:r>
+            <w:proofErr w:type="spellEnd"/>
           </w:p>
         </w:tc>
         <w:tc>
@@ -740,6 +821,7 @@
                 <w:szCs w:val="18"/>
               </w:rPr>
             </w:pPr>
+            <w:proofErr w:type="spellStart"/>
             <w:r>
               <w:rPr>
                 <w:sz w:val="18"/>
@@ -747,6 +829,7 @@
               </w:rPr>
               <w:t>productRequestSchema</w:t>
             </w:r>
+            <w:proofErr w:type="spellEnd"/>
           </w:p>
         </w:tc>
         <w:tc>
@@ -760,6 +843,7 @@
                 <w:szCs w:val="18"/>
               </w:rPr>
             </w:pPr>
+            <w:proofErr w:type="spellStart"/>
             <w:r>
               <w:rPr>
                 <w:sz w:val="18"/>
@@ -767,6 +851,7 @@
               </w:rPr>
               <w:t>productResponseSchema</w:t>
             </w:r>
+            <w:proofErr w:type="spellEnd"/>
           </w:p>
         </w:tc>
       </w:tr>
@@ -782,6 +867,7 @@
                 <w:szCs w:val="18"/>
               </w:rPr>
             </w:pPr>
+            <w:proofErr w:type="spellStart"/>
             <w:r>
               <w:rPr>
                 <w:sz w:val="18"/>
@@ -789,6 +875,7 @@
               </w:rPr>
               <w:t>updateProductPrice</w:t>
             </w:r>
+            <w:proofErr w:type="spellEnd"/>
           </w:p>
         </w:tc>
         <w:tc>
@@ -802,6 +889,7 @@
                 <w:szCs w:val="18"/>
               </w:rPr>
             </w:pPr>
+            <w:proofErr w:type="spellStart"/>
             <w:r>
               <w:rPr>
                 <w:sz w:val="18"/>
@@ -809,6 +897,7 @@
               </w:rPr>
               <w:t>updateProductPriceSchema</w:t>
             </w:r>
+            <w:proofErr w:type="spellEnd"/>
           </w:p>
         </w:tc>
         <w:tc>
@@ -822,6 +911,7 @@
                 <w:szCs w:val="18"/>
               </w:rPr>
             </w:pPr>
+            <w:proofErr w:type="spellStart"/>
             <w:r>
               <w:rPr>
                 <w:sz w:val="18"/>
@@ -829,6 +919,7 @@
               </w:rPr>
               <w:t>updateProductResponseSchema</w:t>
             </w:r>
+            <w:proofErr w:type="spellEnd"/>
           </w:p>
         </w:tc>
       </w:tr>
@@ -844,6 +935,7 @@
                 <w:szCs w:val="18"/>
               </w:rPr>
             </w:pPr>
+            <w:proofErr w:type="spellStart"/>
             <w:r>
               <w:rPr>
                 <w:sz w:val="18"/>
@@ -851,6 +943,7 @@
               </w:rPr>
               <w:t>updateProduct</w:t>
             </w:r>
+            <w:proofErr w:type="spellEnd"/>
           </w:p>
         </w:tc>
         <w:tc>
@@ -864,6 +957,7 @@
                 <w:szCs w:val="18"/>
               </w:rPr>
             </w:pPr>
+            <w:proofErr w:type="spellStart"/>
             <w:r>
               <w:rPr>
                 <w:sz w:val="18"/>
@@ -871,6 +965,7 @@
               </w:rPr>
               <w:t>updateProductSchema</w:t>
             </w:r>
+            <w:proofErr w:type="spellEnd"/>
           </w:p>
         </w:tc>
         <w:tc>
@@ -884,6 +979,7 @@
                 <w:szCs w:val="18"/>
               </w:rPr>
             </w:pPr>
+            <w:proofErr w:type="spellStart"/>
             <w:r>
               <w:rPr>
                 <w:sz w:val="18"/>
@@ -891,6 +987,7 @@
               </w:rPr>
               <w:t>updateProductResponseSchema</w:t>
             </w:r>
+            <w:proofErr w:type="spellEnd"/>
           </w:p>
         </w:tc>
       </w:tr>
@@ -906,6 +1003,7 @@
                 <w:szCs w:val="18"/>
               </w:rPr>
             </w:pPr>
+            <w:proofErr w:type="spellStart"/>
             <w:r>
               <w:rPr>
                 <w:sz w:val="18"/>
@@ -913,6 +1011,7 @@
               </w:rPr>
               <w:t>updateProductGarmentWeight</w:t>
             </w:r>
+            <w:proofErr w:type="spellEnd"/>
           </w:p>
         </w:tc>
         <w:tc>
@@ -926,6 +1025,7 @@
                 <w:szCs w:val="18"/>
               </w:rPr>
             </w:pPr>
+            <w:proofErr w:type="spellStart"/>
             <w:r>
               <w:rPr>
                 <w:sz w:val="18"/>
@@ -933,6 +1033,7 @@
               </w:rPr>
               <w:t>productGarmentWeightSchema</w:t>
             </w:r>
+            <w:proofErr w:type="spellEnd"/>
           </w:p>
         </w:tc>
         <w:tc>
@@ -946,6 +1047,7 @@
                 <w:szCs w:val="18"/>
               </w:rPr>
             </w:pPr>
+            <w:proofErr w:type="spellStart"/>
             <w:r>
               <w:rPr>
                 <w:sz w:val="18"/>
@@ -953,6 +1055,7 @@
               </w:rPr>
               <w:t>updateProductResponseSchema</w:t>
             </w:r>
+            <w:proofErr w:type="spellEnd"/>
           </w:p>
         </w:tc>
       </w:tr>
@@ -968,6 +1071,7 @@
                 <w:szCs w:val="18"/>
               </w:rPr>
             </w:pPr>
+            <w:proofErr w:type="spellStart"/>
             <w:r>
               <w:rPr>
                 <w:sz w:val="18"/>
@@ -975,6 +1079,7 @@
               </w:rPr>
               <w:t>updateProductSupplyType</w:t>
             </w:r>
+            <w:proofErr w:type="spellEnd"/>
           </w:p>
         </w:tc>
         <w:tc>
@@ -988,6 +1093,7 @@
                 <w:szCs w:val="18"/>
               </w:rPr>
             </w:pPr>
+            <w:proofErr w:type="spellStart"/>
             <w:r>
               <w:rPr>
                 <w:sz w:val="18"/>
@@ -995,6 +1101,7 @@
               </w:rPr>
               <w:t>productSupplyTypeSchema</w:t>
             </w:r>
+            <w:proofErr w:type="spellEnd"/>
           </w:p>
         </w:tc>
         <w:tc>
@@ -1008,6 +1115,7 @@
                 <w:szCs w:val="18"/>
               </w:rPr>
             </w:pPr>
+            <w:proofErr w:type="spellStart"/>
             <w:r>
               <w:rPr>
                 <w:sz w:val="18"/>
@@ -1015,6 +1123,7 @@
               </w:rPr>
               <w:t>updateProductResponseSchema</w:t>
             </w:r>
+            <w:proofErr w:type="spellEnd"/>
           </w:p>
         </w:tc>
       </w:tr>
@@ -1030,6 +1139,7 @@
                 <w:szCs w:val="18"/>
               </w:rPr>
             </w:pPr>
+            <w:proofErr w:type="spellStart"/>
             <w:r>
               <w:rPr>
                 <w:sz w:val="18"/>
@@ -1037,6 +1147,7 @@
               </w:rPr>
               <w:t>searchProducts</w:t>
             </w:r>
+            <w:proofErr w:type="spellEnd"/>
           </w:p>
         </w:tc>
         <w:tc>
@@ -1050,6 +1161,7 @@
                 <w:szCs w:val="18"/>
               </w:rPr>
             </w:pPr>
+            <w:proofErr w:type="spellStart"/>
             <w:r>
               <w:rPr>
                 <w:sz w:val="18"/>
@@ -1057,6 +1169,7 @@
               </w:rPr>
               <w:t>searchProductSchema</w:t>
             </w:r>
+            <w:proofErr w:type="spellEnd"/>
           </w:p>
         </w:tc>
         <w:tc>
@@ -1070,6 +1183,7 @@
                 <w:szCs w:val="18"/>
               </w:rPr>
             </w:pPr>
+            <w:proofErr w:type="spellStart"/>
             <w:r>
               <w:rPr>
                 <w:sz w:val="18"/>
@@ -1077,6 +1191,7 @@
               </w:rPr>
               <w:t>searchProductArrayResponseSchema</w:t>
             </w:r>
+            <w:proofErr w:type="spellEnd"/>
           </w:p>
         </w:tc>
       </w:tr>

</xml_diff>